<commit_message>
Conciliación: biblias verificadas, el grupo pagó las 52
El reembolso a JM del 19/08 es 35,360 = 52 × 680 exactos. El presupuesto
oficial solo contemplaba 50 (34,000) porque 2 las pagaría Camila
Fernández: esas 2 (1,360) quedaron dentro de lo que pagó el grupo. No hay
aporte suyo en las 49 donaciones ni ningún movimiento de 1,360.

Queda por confirmar con ella si puso el dinero de su bolsillo, para
reembolsarlo o registrarlo como donación en especie. La caja y el cuadre
con el banco no cambian en ningún caso.

Auditoría: 37/37. verify.py: 9/9 PASS.

Co-Authored-By: Claude Opus 5 <noreply@anthropic.com>
Claude-Session: https://claude.ai/code/session_016scja59CycFFrqKgYsUPWh
</commit_message>
<xml_diff>
--- a/data/presupuesto/Informe_Economico_ETC88.docx
+++ b/data/presupuesto/Informe_Economico_ETC88.docx
@@ -633,7 +633,7 @@
           <w:b w:val="0"/>
           <w:i w:val="0"/>
         </w:rPr>
-        <w:t>Después del retiro se cruzó cada gasto del registro con su partida del presupuesto oficial, se valoró lo donado en especie al precio del presupuesto y se comprobó el resultado contra el banco. Sobre el resultado corren 36 verificaciones numéricas; todas cuadran.</w:t>
+        <w:t>Después del retiro se cruzó cada gasto del registro con su partida del presupuesto oficial, se valoró lo donado en especie al precio del presupuesto y se comprobó el resultado contra el banco. Sobre el resultado corren 37 verificaciones numéricas; todas cuadran.</w:t>
       </w:r>
     </w:p>
     <w:p>
@@ -4545,6 +4545,21 @@
       </w:r>
       <w:r>
         <w:t>Dejar constancia en el acta de ese depósito de 1,000 y de que la donación de Yendry Rincón no tiene captura.</w:t>
+      </w:r>
+    </w:p>
+    <w:p>
+      <w:pPr>
+        <w:pStyle w:val="ListBullet"/>
+        <w:spacing w:after="60"/>
+      </w:pPr>
+      <w:r>
+        <w:rPr>
+          <w:b/>
+        </w:rPr>
+        <w:t xml:space="preserve">Biblias: las 2 de Camila: </w:t>
+      </w:r>
+      <w:r>
+        <w:t>Confirmar con Camila y con Juan Manuel: si ella puso 1,360 de su bolsillo, o se le reembolsa, o se registra como donación en especie (el costo del retiro subiría a 618,429 y la especie a 93,765). La caja y el cuadre con el banco no cambian en ningún caso.</w:t>
       </w:r>
     </w:p>
     <w:p>
@@ -14892,7 +14907,7 @@
               <w:rPr>
                 <w:sz w:val="16"/>
               </w:rPr>
-              <w:t>Biblias: reembolso 35,360 = proforma 34,000 + 1,360; donaciones etiquetadas "biblia"</w:t>
+              <w:t>Biblias: el pago de 35,360 = 52 × 680 exactos</w:t>
             </w:r>
           </w:p>
         </w:tc>
@@ -14910,7 +14925,7 @@
               <w:rPr>
                 <w:sz w:val="16"/>
               </w:rPr>
-              <w:t>16,500</w:t>
+              <w:t>35,360</w:t>
             </w:r>
           </w:p>
         </w:tc>
@@ -14928,7 +14943,7 @@
               <w:rPr>
                 <w:sz w:val="16"/>
               </w:rPr>
-              <w:t>16,500</w:t>
+              <w:t>35,360</w:t>
             </w:r>
           </w:p>
         </w:tc>
@@ -14966,7 +14981,7 @@
               <w:rPr>
                 <w:sz w:val="16"/>
               </w:rPr>
-              <w:t>Donaciones que requieren nota: el depósito sin dueño y la de Yendry sin captura</w:t>
+              <w:t>Biblias: donaciones en efectivo etiquetadas "biblia"</w:t>
             </w:r>
           </w:p>
         </w:tc>
@@ -14985,7 +15000,7 @@
               <w:rPr>
                 <w:sz w:val="16"/>
               </w:rPr>
-              <w:t>2,000</w:t>
+              <w:t>16,500</w:t>
             </w:r>
           </w:p>
         </w:tc>
@@ -15004,7 +15019,7 @@
               <w:rPr>
                 <w:sz w:val="16"/>
               </w:rPr>
-              <w:t>2,000</w:t>
+              <w:t>16,500</w:t>
             </w:r>
           </w:p>
         </w:tc>
@@ -15040,7 +15055,7 @@
               <w:rPr>
                 <w:sz w:val="16"/>
               </w:rPr>
-              <w:t>Costo del retiro = caja + especie + cortesías (8 × 500 + 2 × 2,360)</w:t>
+              <w:t>Donaciones que requieren nota: el depósito sin dueño y la de Yendry sin captura</w:t>
             </w:r>
           </w:p>
         </w:tc>
@@ -15058,7 +15073,7 @@
               <w:rPr>
                 <w:sz w:val="16"/>
               </w:rPr>
-              <w:t>617,069</w:t>
+              <w:t>2,000</w:t>
             </w:r>
           </w:p>
         </w:tc>
@@ -15076,7 +15091,7 @@
               <w:rPr>
                 <w:sz w:val="16"/>
               </w:rPr>
-              <w:t>617,069</w:t>
+              <w:t>2,000</w:t>
             </w:r>
           </w:p>
         </w:tc>
@@ -15114,7 +15129,7 @@
               <w:rPr>
                 <w:sz w:val="16"/>
               </w:rPr>
-              <w:t>Apoyo total donado = efectivo + especie</w:t>
+              <w:t>Costo del retiro = caja + especie + cortesías (8 × 500 + 2 × 2,360)</w:t>
             </w:r>
           </w:p>
         </w:tc>
@@ -15133,7 +15148,7 @@
               <w:rPr>
                 <w:sz w:val="16"/>
               </w:rPr>
-              <w:t>247,426</w:t>
+              <w:t>617,069</w:t>
             </w:r>
           </w:p>
         </w:tc>
@@ -15141,6 +15156,78 @@
           <w:tcPr>
             <w:tcW w:type="dxa" w:w="1474"/>
             <w:shd w:val="clear" w:color="auto" w:fill="F7F3EA"/>
+          </w:tcPr>
+          <w:p>
+            <w:pPr>
+              <w:spacing w:after="0"/>
+              <w:jc w:val="right"/>
+            </w:pPr>
+            <w:r/>
+            <w:r>
+              <w:rPr>
+                <w:sz w:val="16"/>
+              </w:rPr>
+              <w:t>617,069</w:t>
+            </w:r>
+          </w:p>
+        </w:tc>
+      </w:tr>
+      <w:tr>
+        <w:tc>
+          <w:tcPr>
+            <w:tcW w:type="dxa" w:w="510"/>
+          </w:tcPr>
+          <w:p>
+            <w:pPr>
+              <w:spacing w:after="0"/>
+            </w:pPr>
+            <w:r/>
+            <w:r>
+              <w:rPr>
+                <w:sz w:val="16"/>
+              </w:rPr>
+              <w:t>37</w:t>
+            </w:r>
+          </w:p>
+        </w:tc>
+        <w:tc>
+          <w:tcPr>
+            <w:tcW w:type="dxa" w:w="6236"/>
+          </w:tcPr>
+          <w:p>
+            <w:pPr>
+              <w:spacing w:after="0"/>
+            </w:pPr>
+            <w:r/>
+            <w:r>
+              <w:rPr>
+                <w:sz w:val="16"/>
+              </w:rPr>
+              <w:t>Apoyo total donado = efectivo + especie</w:t>
+            </w:r>
+          </w:p>
+        </w:tc>
+        <w:tc>
+          <w:tcPr>
+            <w:tcW w:type="dxa" w:w="1474"/>
+          </w:tcPr>
+          <w:p>
+            <w:pPr>
+              <w:spacing w:after="0"/>
+              <w:jc w:val="right"/>
+            </w:pPr>
+            <w:r/>
+            <w:r>
+              <w:rPr>
+                <w:sz w:val="16"/>
+              </w:rPr>
+              <w:t>247,426</w:t>
+            </w:r>
+          </w:p>
+        </w:tc>
+        <w:tc>
+          <w:tcPr>
+            <w:tcW w:type="dxa" w:w="1474"/>
           </w:tcPr>
           <w:p>
             <w:pPr>
@@ -15173,7 +15260,7 @@
           <w:i/>
           <w:color w:val="666666"/>
         </w:rPr>
-        <w:t>36 de 36 verificaciones cuadran.</w:t>
+        <w:t>37 de 37 verificaciones cuadran.</w:t>
       </w:r>
     </w:p>
     <w:sectPr>

</xml_diff>

<commit_message>
Conciliación: restituida la nota de los 400 sin explicar en las habitaciones
Los 1,800 son firmes (lo que queda del pago a la casa). La tarifa de
900/noche está inferida de ahí, y el desglose verbal del 10-sep
(700 × 2 + 800 = 2,200) daría 400 más de lo que la casa cobró. Queda
como nota: una línea de la factura lo cierra y no afecta ningún total.

Con esto, los tres puntos blandos del cierre quedan visibles en el
documento: el reparto del impuesto, la tarifa de las habitaciones y las
2 biblias de Camila.

Co-Authored-By: Claude Opus 5 <noreply@anthropic.com>
Claude-Session: https://claude.ai/code/session_016scja59CycFFrqKgYsUPWh
</commit_message>
<xml_diff>
--- a/data/presupuesto/Informe_Economico_ETC88.docx
+++ b/data/presupuesto/Informe_Economico_ETC88.docx
@@ -4560,6 +4560,21 @@
       </w:r>
       <w:r>
         <w:t>Confirmar con Camila y con Juan Manuel: si ella puso 1,360 de su bolsillo, o se le reembolsa, o se registra como donación en especie (el costo del retiro subiría a 618,429 y la especie a 93,765). La caja y el cuadre con el banco no cambian en ningún caso.</w:t>
+      </w:r>
+    </w:p>
+    <w:p>
+      <w:pPr>
+        <w:pStyle w:val="ListBullet"/>
+        <w:spacing w:after="60"/>
+      </w:pPr>
+      <w:r>
+        <w:rPr>
+          <w:b/>
+        </w:rPr>
+        <w:t xml:space="preserve">Habitaciones de pequeños grupos: 400 sin explicar: </w:t>
+      </w:r>
+      <w:r>
+        <w:t>Una línea de la factura de la casa lo cierra. No afecta ningún total: lo pagado es lo pagado.</w:t>
       </w:r>
     </w:p>
     <w:p>

</xml_diff>